<commit_message>
docs: reconcile I–P term + en-dash across VI corpus
Unify the internationalization–performance term, which diverged between the
two 09b glossaries (thesis #35 used hyphen + "kinh doanh" suffix;
writing_guides #40c used en-dash, no suffix):

- Phrase → "quốc tế hóa–hiệu quả" (en-dash, no suffix), matching the English
  "internationalization–performance" exactly. Collapsed "quốc tế hóa-hiệu
  quả kinh doanh" (4×) and "quốc tế hóa–hiệu quả doanh nghiệp" (8×) and the
  hyphen form (13 repl total). Verified no dropped suffix broke a sentence.
- Acronym → "I–P" (en-dash) per the glossary's own documented rule, applied
  to Vietnamese files + glossaries only (27 repl). The 32 hyphen "I-P" in the
  English manuscripts (p8 en_clean, cover letter) are left as those papers'
  own typography, out of VI-standardization scope.
- Aligned thesis/09b #35 to writing_guides #40c.

Rebuilt canonical DOCX (CD1/CD2, luận án CTU, P3/P4/P5 vi+en).
</commit_message>
<xml_diff>
--- a/dist/chuyen_de_1/14_part1_intro_theory.docx
+++ b/dist/chuyen_de_1/14_part1_intro_theory.docx
@@ -4707,7 +4707,7 @@
           <w:bCs/>
           <w:b/>
         </w:rPr>
-        <w:t xml:space="preserve">(a) Hình dáng đường cong I-P (Internationalization-Performance)</w:t>
+        <w:t xml:space="preserve">(a) Hình dáng đường cong I–P (Internationalization-Performance)</w:t>
       </w:r>
       <w:r>
         <w:t xml:space="preserve">: Việt Nam → Inverted-U rõ nét, điểm ngưỡng (TP) ≈ 39-46% FSTS xuyên 3 wave 2009-2023; Lind-Mehlum p&lt;0,013. Singapore → tuyến tính dương + bậc hai nhẹ, TP ≈ 82% FSTS (vùng dữ liệu thưa, 3,2% firms vượt 70% FSTS); Lind-Mehlum p=0,303 KHÔNG xác nhận.</w:t>
@@ -4840,7 +4840,7 @@
         <w:t xml:space="preserve"> </w:t>
       </w:r>
       <w:r>
-        <w:t xml:space="preserve">nâng cao productivity floor nhưng KHÔNG điều tiết I-P curve.</w:t>
+        <w:t xml:space="preserve">nâng cao productivity floor nhưng KHÔNG điều tiết I–P curve.</w:t>
       </w:r>
     </w:p>
     <w:p>

</xml_diff>